<commit_message>
Unificar integrantes Daniela Peña y Mirko Flores en documentación
</commit_message>
<xml_diff>
--- a/docs/informe_tecnico_DanielaPeña_MirkoFlores_014V.docx
+++ b/docs/informe_tecnico_DanielaPeña_MirkoFlores_014V.docx
@@ -64,13 +64,13 @@
           <w:lang w:val="es-CL"/>
         </w:rPr>
         <w:br/>
-        <w:t>Autora: Daniela Peña</w:t>
+        <w:t xml:space="preserve">Integrantes: Daniela Peña y Mirko Flores</w:t>
       </w:r>
       <w:r>
         <w:rPr>
           <w:lang w:val="es-CL"/>
         </w:rPr>
-        <w:t xml:space="preserve"> – Mirko Flores</w:t>
+        <w:t xml:space="preserve"/>
       </w:r>
       <w:r>
         <w:rPr>
@@ -1982,7 +1982,7 @@
           <w:sz w:val="16"/>
           <w:lang w:val="es-CL"/>
         </w:rPr>
-        <w:t>Estado del caso: propuesta preparada para revisión docente. No se ha recibido una aprobación. La modalidad individual solicitada debe confirmarse, pues la pauta establece trabajo en parejas.</w:t>
+        <w:t xml:space="preserve">Estado del caso: propuesta preparada para revisión docente. No se ha recibido una aprobación. El equipo está integrado por Daniela Peña y Mirko Flores, conforme a la modalidad en parejas.</w:t>
       </w:r>
     </w:p>
     <w:p>
@@ -2821,7 +2821,7 @@
                 <w:sz w:val="18"/>
                 <w:lang w:val="es-CL"/>
               </w:rPr>
-              <w:t>Aspecto que debe fundamentar la autora</w:t>
+              <w:t xml:space="preserve">Aspecto que debe fundamentar Daniela Peña y Mirko Flores</w:t>
             </w:r>
           </w:p>
         </w:tc>
@@ -3040,7 +3040,7 @@
           <w:sz w:val="16"/>
           <w:lang w:val="es-CL"/>
         </w:rPr>
-        <w:t>La pauta exige que las justificaciones técnicas definitivas sean propias. Daniela debe redactar y validar esa fundamentación a partir de la ejecución y del análisis del código antes de entregar.</w:t>
+        <w:t xml:space="preserve">La pauta exige que las justificaciones técnicas definitivas sean propias. Daniela Peña y Mirko Flores deben redactar y validar esa fundamentación a partir de la ejecución y del análisis del código antes de entregar.</w:t>
       </w:r>
     </w:p>
     <w:p>
@@ -3525,7 +3525,7 @@
         <w:rPr>
           <w:lang w:val="es-CL"/>
         </w:rPr>
-        <w:t>La evaluación no demuestra una reducción real de tickets ni tiempos de atención. C04 omitió aclarar que el plazo es un objetivo, C07 explicó MFA de forma poco clara y A03 amplió demasiado una prohibición. Las citas válidas no evitaron estas imprecisiones. Los resultados requieren la revisión de Daniela y más preguntas independientes. El servidor tampoco tiene permisos por documento ni uso multiusuario.</w:t>
+        <w:t xml:space="preserve">La evaluación no demuestra una reducción real de tickets ni tiempos de atención. C04 omitió aclarar que el plazo es un objetivo, C07 explicó MFA de forma poco clara y A03 amplió demasiado una prohibición. Las citas válidas no evitaron estas imprecisiones. Los resultados requieren la revisión de Daniela Peña y Mirko Flores y más preguntas independientes. El servidor tampoco tiene permisos por documento ni uso multiusuario.</w:t>
       </w:r>
     </w:p>
     <w:p>
@@ -4053,7 +4053,7 @@
       <w:rPr>
         <w:sz w:val="16"/>
       </w:rPr>
-      <w:t xml:space="preserve">Daniela Peña · ISY0101 · Página </w:t>
+      <w:t xml:space="preserve">Daniela Peña y Mirko Flores · ISY0101 · Página </w:t>
     </w:r>
     <w:r>
       <w:fldChar w:fldCharType="begin"/>

</xml_diff>